<commit_message>
fix(bid): enforce technical deviation table output
</commit_message>
<xml_diff>
--- a/packages/bid/bid/assets/templates/default-technical-bid.docx
+++ b/packages/bid/bid/assets/templates/default-technical-bid.docx
@@ -243,15 +243,17 @@
             <w:tblCaption w:val="dsh-technical-deviation-table"/>
           </w:tblPr>
           <w:tblGrid>
-            <w:gridCol w:w="788"/>
-            <w:gridCol w:w="1233"/>
-            <w:gridCol w:w="549"/>
-            <w:gridCol w:w="4810"/>
-            <w:gridCol w:w="4250"/>
-            <w:gridCol w:w="1377"/>
-            <w:gridCol w:w="718"/>
+            <w:gridCol w:w="824"/>
+            <w:gridCol w:w="1235"/>
+            <w:gridCol w:w="5353"/>
+            <w:gridCol w:w="4255"/>
+            <w:gridCol w:w="1373"/>
+            <w:gridCol w:w="686"/>
           </w:tblGrid>
           <w:tr>
+            <w:trPr>
+              <w:tblHeader/>
+            </w:trPr>
             <w:tblPrEx>
               <w:tblBorders>
                 <w:top w:val="single" w:color="auto" w:sz="4" w:space="0"/>
@@ -270,7 +272,7 @@
             </w:tblPrEx>
             <w:tc>
               <w:tcPr>
-                <w:tcW w:w="287" w:type="pct"/>
+                <w:tcW w:w="295" w:type="pct"/>
                 <w:tcBorders>
                   <w:top w:val="single" w:color="auto" w:sz="4" w:space="0"/>
                   <w:left w:val="single" w:color="auto" w:sz="4" w:space="0"/>
@@ -278,6 +280,7 @@
                   <w:right w:val="single" w:color="auto" w:sz="4" w:space="0"/>
                 </w:tcBorders>
                 <w:vAlign w:val="center"/>
+                <w:shd w:val="clear" w:color="auto" w:fill="FFFFFF"/>
               </w:tcPr>
               <w:p>
                 <w:pPr>
@@ -304,7 +307,7 @@
             </w:tc>
             <w:tc>
               <w:tcPr>
-                <w:tcW w:w="449" w:type="pct"/>
+                <w:tcW w:w="443" w:type="pct"/>
                 <w:tcBorders>
                   <w:top w:val="single" w:color="auto" w:sz="4" w:space="0"/>
                   <w:left w:val="single" w:color="auto" w:sz="4" w:space="0"/>
@@ -312,6 +315,7 @@
                   <w:right w:val="single" w:color="auto" w:sz="4" w:space="0"/>
                 </w:tcBorders>
                 <w:vAlign w:val="center"/>
+                <w:shd w:val="clear" w:color="auto" w:fill="FFFFFF"/>
               </w:tcPr>
               <w:p>
                 <w:pPr>
@@ -338,8 +342,7 @@
             </w:tc>
             <w:tc>
               <w:tcPr>
-                <w:tcW w:w="1951" w:type="pct"/>
-                <w:gridSpan w:val="2"/>
+                <w:tcW w:w="1919" w:type="pct"/>
                 <w:tcBorders>
                   <w:top w:val="single" w:color="auto" w:sz="4" w:space="0"/>
                   <w:left w:val="single" w:color="auto" w:sz="4" w:space="0"/>
@@ -347,6 +350,7 @@
                   <w:right w:val="single" w:color="auto" w:sz="4" w:space="0"/>
                 </w:tcBorders>
                 <w:vAlign w:val="center"/>
+                <w:shd w:val="clear" w:color="auto" w:fill="FFFFFF"/>
               </w:tcPr>
               <w:p>
                 <w:pPr>
@@ -373,7 +377,7 @@
             </w:tc>
             <w:tc>
               <w:tcPr>
-                <w:tcW w:w="1547" w:type="pct"/>
+                <w:tcW w:w="1525" w:type="pct"/>
                 <w:tcBorders>
                   <w:top w:val="single" w:color="auto" w:sz="4" w:space="0"/>
                   <w:left w:val="single" w:color="auto" w:sz="4" w:space="0"/>
@@ -381,6 +385,7 @@
                   <w:right w:val="single" w:color="auto" w:sz="4" w:space="0"/>
                 </w:tcBorders>
                 <w:vAlign w:val="center"/>
+                <w:shd w:val="clear" w:color="auto" w:fill="FFFFFF"/>
               </w:tcPr>
               <w:p>
                 <w:pPr>
@@ -407,7 +412,7 @@
             </w:tc>
             <w:tc>
               <w:tcPr>
-                <w:tcW w:w="501" w:type="pct"/>
+                <w:tcW w:w="492" w:type="pct"/>
                 <w:tcBorders>
                   <w:top w:val="single" w:color="auto" w:sz="4" w:space="0"/>
                   <w:left w:val="single" w:color="auto" w:sz="4" w:space="0"/>
@@ -415,6 +420,7 @@
                   <w:right w:val="single" w:color="auto" w:sz="4" w:space="0"/>
                 </w:tcBorders>
                 <w:vAlign w:val="center"/>
+                <w:shd w:val="clear" w:color="auto" w:fill="FFFFFF"/>
               </w:tcPr>
               <w:p>
                 <w:pPr>
@@ -441,7 +447,7 @@
             </w:tc>
             <w:tc>
               <w:tcPr>
-                <w:tcW w:w="261" w:type="pct"/>
+                <w:tcW w:w="246" w:type="pct"/>
                 <w:tcBorders>
                   <w:top w:val="single" w:color="auto" w:sz="4" w:space="0"/>
                   <w:left w:val="single" w:color="auto" w:sz="4" w:space="0"/>
@@ -449,6 +455,7 @@
                   <w:right w:val="single" w:color="auto" w:sz="4" w:space="0"/>
                 </w:tcBorders>
                 <w:vAlign w:val="center"/>
+                <w:shd w:val="clear" w:color="auto" w:fill="FFFFFF"/>
               </w:tcPr>
               <w:p>
                 <w:pPr>
@@ -493,47 +500,7 @@
             </w:tblPrEx>
             <w:tc>
               <w:tcPr>
-                <w:tcW w:w="287" w:type="pct"/>
-                <w:tcBorders>
-                  <w:top w:val="single" w:color="auto" w:sz="4" w:space="0"/>
-                  <w:left w:val="single" w:color="auto" w:sz="4" w:space="0"/>
-                  <w:bottom w:val="single" w:color="auto" w:sz="4" w:space="0"/>
-                  <w:right w:val="single" w:color="auto" w:sz="4" w:space="0"/>
-                </w:tcBorders>
-                <w:vAlign w:val="center"/>
-              </w:tcPr>
-              <w:p>
-                <w:pPr>
-                  <w:pStyle w:val="38"/>
-                </w:pPr>
-                <w:r>
-                  <w:rPr>
-                    <w:rFonts w:hint="eastAsia"/>
-                  </w:rPr>
-                  <w:t>1</w:t>
-                </w:r>
-              </w:p>
-            </w:tc>
-            <w:tc>
-              <w:tcPr>
-                <w:tcW w:w="449" w:type="pct"/>
-                <w:vMerge w:val="restart"/>
-                <w:tcBorders>
-                  <w:top w:val="single" w:color="auto" w:sz="4" w:space="0"/>
-                  <w:left w:val="single" w:color="auto" w:sz="4" w:space="0"/>
-                  <w:right w:val="single" w:color="auto" w:sz="4" w:space="0"/>
-                </w:tcBorders>
-                <w:vAlign w:val="center"/>
-              </w:tcPr>
-              <w:p>
-                <w:pPr>
-                  <w:pStyle w:val="38"/>
-                </w:pPr>
-              </w:p>
-            </w:tc>
-            <w:tc>
-              <w:tcPr>
-                <w:tcW w:w="200" w:type="pct"/>
+                <w:tcW w:w="295" w:type="pct"/>
                 <w:tcBorders>
                   <w:top w:val="single" w:color="auto" w:sz="4" w:space="0"/>
                   <w:left w:val="single" w:color="auto" w:sz="4" w:space="0"/>
@@ -550,7 +517,23 @@
             </w:tc>
             <w:tc>
               <w:tcPr>
-                <w:tcW w:w="1751" w:type="pct"/>
+                <w:tcW w:w="443" w:type="pct"/>
+                <w:tcBorders>
+                  <w:top w:val="single" w:color="auto" w:sz="4" w:space="0"/>
+                  <w:left w:val="single" w:color="auto" w:sz="4" w:space="0"/>
+                  <w:right w:val="single" w:color="auto" w:sz="4" w:space="0"/>
+                </w:tcBorders>
+                <w:vAlign w:val="center"/>
+              </w:tcPr>
+              <w:p>
+                <w:pPr>
+                  <w:pStyle w:val="38"/>
+                </w:pPr>
+              </w:p>
+            </w:tc>
+            <w:tc>
+              <w:tcPr>
+                <w:tcW w:w="1919" w:type="pct"/>
                 <w:tcBorders>
                   <w:top w:val="single" w:color="auto" w:sz="4" w:space="0"/>
                   <w:left w:val="single" w:color="auto" w:sz="4" w:space="0"/>
@@ -567,7 +550,7 @@
             </w:tc>
             <w:tc>
               <w:tcPr>
-                <w:tcW w:w="1547" w:type="pct"/>
+                <w:tcW w:w="1525" w:type="pct"/>
                 <w:tcBorders>
                   <w:top w:val="single" w:color="auto" w:sz="4" w:space="0"/>
                   <w:left w:val="single" w:color="auto" w:sz="4" w:space="0"/>
@@ -584,101 +567,7 @@
             </w:tc>
             <w:tc>
               <w:tcPr>
-                <w:tcW w:w="501" w:type="pct"/>
-                <w:tcBorders>
-                  <w:top w:val="single" w:color="auto" w:sz="4" w:space="0"/>
-                  <w:left w:val="single" w:color="auto" w:sz="4" w:space="0"/>
-                  <w:bottom w:val="single" w:color="auto" w:sz="4" w:space="0"/>
-                  <w:right w:val="single" w:color="auto" w:sz="4" w:space="0"/>
-                </w:tcBorders>
-                <w:vAlign w:val="center"/>
-              </w:tcPr>
-              <w:p>
-                <w:pPr>
-                  <w:pStyle w:val="38"/>
-                </w:pPr>
-                <w:r>
-                  <w:t>满足、响应</w:t>
-                </w:r>
-              </w:p>
-            </w:tc>
-            <w:tc>
-              <w:tcPr>
-                <w:tcW w:w="261" w:type="pct"/>
-                <w:tcBorders>
-                  <w:top w:val="single" w:color="auto" w:sz="4" w:space="0"/>
-                  <w:left w:val="single" w:color="auto" w:sz="4" w:space="0"/>
-                  <w:bottom w:val="single" w:color="auto" w:sz="4" w:space="0"/>
-                  <w:right w:val="single" w:color="auto" w:sz="4" w:space="0"/>
-                </w:tcBorders>
-                <w:vAlign w:val="center"/>
-              </w:tcPr>
-              <w:p>
-                <w:pPr>
-                  <w:pStyle w:val="38"/>
-                </w:pPr>
-              </w:p>
-            </w:tc>
-          </w:tr>
-          <w:tr>
-            <w:tblPrEx>
-              <w:tblBorders>
-                <w:top w:val="single" w:color="auto" w:sz="4" w:space="0"/>
-                <w:left w:val="single" w:color="auto" w:sz="4" w:space="0"/>
-                <w:bottom w:val="single" w:color="auto" w:sz="4" w:space="0"/>
-                <w:right w:val="single" w:color="auto" w:sz="4" w:space="0"/>
-                <w:insideH w:val="single" w:color="auto" w:sz="4" w:space="0"/>
-                <w:insideV w:val="single" w:color="auto" w:sz="4" w:space="0"/>
-              </w:tblBorders>
-              <w:tblCellMar>
-                <w:top w:w="0" w:type="dxa"/>
-                <w:left w:w="108" w:type="dxa"/>
-                <w:bottom w:w="0" w:type="dxa"/>
-                <w:right w:w="108" w:type="dxa"/>
-              </w:tblCellMar>
-            </w:tblPrEx>
-            <w:tc>
-              <w:tcPr>
-                <w:tcW w:w="287" w:type="pct"/>
-                <w:tcBorders>
-                  <w:top w:val="single" w:color="auto" w:sz="4" w:space="0"/>
-                  <w:left w:val="single" w:color="auto" w:sz="4" w:space="0"/>
-                  <w:bottom w:val="single" w:color="auto" w:sz="4" w:space="0"/>
-                  <w:right w:val="single" w:color="auto" w:sz="4" w:space="0"/>
-                </w:tcBorders>
-                <w:vAlign w:val="center"/>
-              </w:tcPr>
-              <w:p>
-                <w:pPr>
-                  <w:pStyle w:val="38"/>
-                </w:pPr>
-                <w:r>
-                  <w:rPr>
-                    <w:rFonts w:hint="eastAsia"/>
-                  </w:rPr>
-                  <w:t>2</w:t>
-                </w:r>
-              </w:p>
-            </w:tc>
-            <w:tc>
-              <w:tcPr>
-                <w:tcW w:w="449" w:type="pct"/>
-                <w:vMerge w:val="continue"/>
-                <w:tcBorders>
-                  <w:left w:val="single" w:color="auto" w:sz="4" w:space="0"/>
-                  <w:right w:val="single" w:color="auto" w:sz="4" w:space="0"/>
-                </w:tcBorders>
-                <w:vAlign w:val="center"/>
-              </w:tcPr>
-              <w:p>
-                <w:pPr>
-                  <w:pStyle w:val="38"/>
-                </w:pPr>
-              </w:p>
-            </w:tc>
-            <w:tc>
-              <w:tcPr>
-                <w:tcW w:w="200" w:type="pct"/>
+                <w:tcW w:w="492" w:type="pct"/>
                 <w:tcBorders>
                   <w:top w:val="single" w:color="auto" w:sz="4" w:space="0"/>
                   <w:left w:val="single" w:color="auto" w:sz="4" w:space="0"/>
@@ -695,61 +584,7 @@
             </w:tc>
             <w:tc>
               <w:tcPr>
-                <w:tcW w:w="1751" w:type="pct"/>
-                <w:tcBorders>
-                  <w:top w:val="single" w:color="auto" w:sz="4" w:space="0"/>
-                  <w:left w:val="single" w:color="auto" w:sz="4" w:space="0"/>
-                  <w:bottom w:val="single" w:color="auto" w:sz="4" w:space="0"/>
-                  <w:right w:val="single" w:color="auto" w:sz="4" w:space="0"/>
-                </w:tcBorders>
-                <w:vAlign w:val="center"/>
-              </w:tcPr>
-              <w:p>
-                <w:pPr>
-                  <w:pStyle w:val="38"/>
-                </w:pPr>
-              </w:p>
-            </w:tc>
-            <w:tc>
-              <w:tcPr>
-                <w:tcW w:w="1547" w:type="pct"/>
-                <w:tcBorders>
-                  <w:top w:val="single" w:color="auto" w:sz="4" w:space="0"/>
-                  <w:left w:val="single" w:color="auto" w:sz="4" w:space="0"/>
-                  <w:bottom w:val="single" w:color="auto" w:sz="4" w:space="0"/>
-                  <w:right w:val="single" w:color="auto" w:sz="4" w:space="0"/>
-                </w:tcBorders>
-                <w:vAlign w:val="center"/>
-              </w:tcPr>
-              <w:p>
-                <w:pPr>
-                  <w:pStyle w:val="38"/>
-                </w:pPr>
-              </w:p>
-            </w:tc>
-            <w:tc>
-              <w:tcPr>
-                <w:tcW w:w="501" w:type="pct"/>
-                <w:tcBorders>
-                  <w:top w:val="single" w:color="auto" w:sz="4" w:space="0"/>
-                  <w:left w:val="single" w:color="auto" w:sz="4" w:space="0"/>
-                  <w:bottom w:val="single" w:color="auto" w:sz="4" w:space="0"/>
-                  <w:right w:val="single" w:color="auto" w:sz="4" w:space="0"/>
-                </w:tcBorders>
-                <w:vAlign w:val="center"/>
-              </w:tcPr>
-              <w:p>
-                <w:pPr>
-                  <w:pStyle w:val="38"/>
-                </w:pPr>
-                <w:r>
-                  <w:t>满足、响应</w:t>
-                </w:r>
-              </w:p>
-            </w:tc>
-            <w:tc>
-              <w:tcPr>
-                <w:tcW w:w="261" w:type="pct"/>
+                <w:tcW w:w="246" w:type="pct"/>
                 <w:tcBorders>
                   <w:top w:val="single" w:color="auto" w:sz="4" w:space="0"/>
                   <w:left w:val="single" w:color="auto" w:sz="4" w:space="0"/>

</xml_diff>